<commit_message>
Lumen 0.5.0: aba Eleições, carga num comando e publicação na nuvem
</commit_message>
<xml_diff>
--- a/docs/DOC-01_Visao_e_Escopo.docx
+++ b/docs/DOC-01_Visao_e_Escopo.docx
@@ -28,7 +28,7 @@
           <w:sz w:val="20"/>
           <w:szCs w:val="20"/>
         </w:rPr>
-        <w:t xml:space="preserve">Monitoramento de contratacoes e despesas publicas do Brasil</w:t>
+        <w:t xml:space="preserve">Monitoramento de contratações e despesas públicas do Brasil</w:t>
       </w:r>
     </w:p>
     <w:p>
@@ -96,6 +96,9 @@
         <w:gridCol w:w="7200"/>
       </w:tblGrid>
       <w:tr>
+        <w:trPr>
+          <w:cantSplit/>
+        </w:trPr>
         <w:tc>
           <w:tcPr>
             <w:tcW w:type="dxa" w:w="2400"/>
@@ -146,12 +149,15 @@
                 <w:sz w:val="19"/>
                 <w:szCs w:val="19"/>
               </w:rPr>
-              <w:t xml:space="preserve">Lumen (nome de trabalho, sujeito a verificacao de disponibilidade)</w:t>
+              <w:t xml:space="preserve">Lumen (nome de trabalho, sujeito a verificação de disponibilidade)</w:t>
             </w:r>
           </w:p>
         </w:tc>
       </w:tr>
       <w:tr>
+        <w:trPr>
+          <w:cantSplit/>
+        </w:trPr>
         <w:tc>
           <w:tcPr>
             <w:tcW w:type="dxa" w:w="2400"/>
@@ -175,7 +181,7 @@
                 <w:sz w:val="19"/>
                 <w:szCs w:val="19"/>
               </w:rPr>
-              <w:t xml:space="preserve">Responsavel</w:t>
+              <w:t xml:space="preserve">Responsável</w:t>
             </w:r>
           </w:p>
         </w:tc>
@@ -208,6 +214,9 @@
         </w:tc>
       </w:tr>
       <w:tr>
+        <w:trPr>
+          <w:cantSplit/>
+        </w:trPr>
         <w:tc>
           <w:tcPr>
             <w:tcW w:type="dxa" w:w="2400"/>
@@ -231,7 +240,7 @@
                 <w:sz w:val="19"/>
                 <w:szCs w:val="19"/>
               </w:rPr>
-              <w:t xml:space="preserve">Versao</w:t>
+              <w:t xml:space="preserve">Versão</w:t>
             </w:r>
           </w:p>
         </w:tc>
@@ -264,6 +273,9 @@
         </w:tc>
       </w:tr>
       <w:tr>
+        <w:trPr>
+          <w:cantSplit/>
+        </w:trPr>
         <w:tc>
           <w:tcPr>
             <w:tcW w:type="dxa" w:w="2400"/>
@@ -320,6 +332,9 @@
         </w:tc>
       </w:tr>
       <w:tr>
+        <w:trPr>
+          <w:cantSplit/>
+        </w:trPr>
         <w:tc>
           <w:tcPr>
             <w:tcW w:type="dxa" w:w="2400"/>
@@ -343,7 +358,7 @@
                 <w:sz w:val="19"/>
                 <w:szCs w:val="19"/>
               </w:rPr>
-              <w:t xml:space="preserve">Situacao</w:t>
+              <w:t xml:space="preserve">Situação</w:t>
             </w:r>
           </w:p>
         </w:tc>
@@ -370,7 +385,7 @@
                 <w:sz w:val="19"/>
                 <w:szCs w:val="19"/>
               </w:rPr>
-              <w:t xml:space="preserve">Documento base para inicio de desenvolvimento</w:t>
+              <w:t xml:space="preserve">Documento base para início de desenvolvimento</w:t>
             </w:r>
           </w:p>
         </w:tc>
@@ -395,7 +410,7 @@
           <w:sz w:val="18"/>
           <w:szCs w:val="18"/>
         </w:rPr>
-        <w:t xml:space="preserve">Este documento integra o pacote de documentacao do Projeto Lumen. Valores legais, limites e endpoints citados foram verificados em fontes oficiais em setembro de 2026 e devem ser reconferidos antes da implementacao, pois sao atualizados periodicamente por decreto.</w:t>
+        <w:t xml:space="preserve">Este documento integra o pacote de documentação do Projeto Lumen. Valores legais, limites e endpoints citados foram verificados em fontes oficiais em setembro de 2026 e devem ser reconferidos antes da implementação, pois são atualizados periodicamente por decreto.</w:t>
       </w:r>
     </w:p>
     <w:p>
@@ -406,6 +421,8 @@
     <w:p>
       <w:pPr>
         <w:pStyle w:val="Heading1"/>
+        <w:keepNext/>
+        <w:keepLines/>
         <w:spacing w:after="160" w:before="380"/>
       </w:pPr>
       <w:r>
@@ -456,6 +473,8 @@
     <w:p>
       <w:pPr>
         <w:pStyle w:val="Heading1"/>
+        <w:keepNext/>
+        <w:keepLines/>
         <w:spacing w:after="160" w:before="380"/>
       </w:pPr>
       <w:r>
@@ -520,6 +539,9 @@
         <w:gridCol w:w="9600"/>
       </w:tblGrid>
       <w:tr>
+        <w:trPr>
+          <w:cantSplit/>
+        </w:trPr>
         <w:tc>
           <w:tcPr>
             <w:tcW w:type="dxa" w:w="9600"/>
@@ -566,6 +588,8 @@
     <w:p>
       <w:pPr>
         <w:pStyle w:val="Heading1"/>
+        <w:keepNext/>
+        <w:keepLines/>
         <w:spacing w:after="160" w:before="380"/>
       </w:pPr>
       <w:r>
@@ -589,6 +613,8 @@
     <w:p>
       <w:pPr>
         <w:pStyle w:val="Heading2"/>
+        <w:keepNext/>
+        <w:keepLines/>
         <w:spacing w:after="120" w:before="280"/>
       </w:pPr>
       <w:r>
@@ -612,6 +638,8 @@
     <w:p>
       <w:pPr>
         <w:pStyle w:val="Heading2"/>
+        <w:keepNext/>
+        <w:keepLines/>
         <w:spacing w:after="120" w:before="280"/>
       </w:pPr>
       <w:r>
@@ -635,6 +663,8 @@
     <w:p>
       <w:pPr>
         <w:pStyle w:val="Heading2"/>
+        <w:keepNext/>
+        <w:keepLines/>
         <w:spacing w:after="120" w:before="280"/>
       </w:pPr>
       <w:r>
@@ -671,6 +701,9 @@
         <w:gridCol w:w="9600"/>
       </w:tblGrid>
       <w:tr>
+        <w:trPr>
+          <w:cantSplit/>
+        </w:trPr>
         <w:tc>
           <w:tcPr>
             <w:tcW w:type="dxa" w:w="9600"/>
@@ -709,6 +742,8 @@
     <w:p>
       <w:pPr>
         <w:pStyle w:val="Heading1"/>
+        <w:keepNext/>
+        <w:keepLines/>
         <w:spacing w:after="160" w:before="380"/>
       </w:pPr>
       <w:r>
@@ -718,6 +753,8 @@
     <w:p>
       <w:pPr>
         <w:pStyle w:val="Heading2"/>
+        <w:keepNext/>
+        <w:keepLines/>
         <w:spacing w:after="120" w:before="280"/>
       </w:pPr>
       <w:r>
@@ -831,6 +868,9 @@
         </w:tc>
       </w:tr>
       <w:tr>
+        <w:trPr>
+          <w:cantSplit/>
+        </w:trPr>
         <w:tc>
           <w:tcPr>
             <w:tcW w:type="dxa" w:w="800"/>
@@ -914,6 +954,9 @@
         </w:tc>
       </w:tr>
       <w:tr>
+        <w:trPr>
+          <w:cantSplit/>
+        </w:trPr>
         <w:tc>
           <w:tcPr>
             <w:tcW w:type="dxa" w:w="800"/>
@@ -997,6 +1040,9 @@
         </w:tc>
       </w:tr>
       <w:tr>
+        <w:trPr>
+          <w:cantSplit/>
+        </w:trPr>
         <w:tc>
           <w:tcPr>
             <w:tcW w:type="dxa" w:w="800"/>
@@ -1080,6 +1126,9 @@
         </w:tc>
       </w:tr>
       <w:tr>
+        <w:trPr>
+          <w:cantSplit/>
+        </w:trPr>
         <w:tc>
           <w:tcPr>
             <w:tcW w:type="dxa" w:w="800"/>
@@ -1163,6 +1212,9 @@
         </w:tc>
       </w:tr>
       <w:tr>
+        <w:trPr>
+          <w:cantSplit/>
+        </w:trPr>
         <w:tc>
           <w:tcPr>
             <w:tcW w:type="dxa" w:w="800"/>
@@ -1246,6 +1298,9 @@
         </w:tc>
       </w:tr>
       <w:tr>
+        <w:trPr>
+          <w:cantSplit/>
+        </w:trPr>
         <w:tc>
           <w:tcPr>
             <w:tcW w:type="dxa" w:w="800"/>
@@ -1329,6 +1384,9 @@
         </w:tc>
       </w:tr>
       <w:tr>
+        <w:trPr>
+          <w:cantSplit/>
+        </w:trPr>
         <w:tc>
           <w:tcPr>
             <w:tcW w:type="dxa" w:w="800"/>
@@ -1412,6 +1470,9 @@
         </w:tc>
       </w:tr>
       <w:tr>
+        <w:trPr>
+          <w:cantSplit/>
+        </w:trPr>
         <w:tc>
           <w:tcPr>
             <w:tcW w:type="dxa" w:w="800"/>
@@ -1498,6 +1559,8 @@
     <w:p>
       <w:pPr>
         <w:pStyle w:val="Heading2"/>
+        <w:keepNext/>
+        <w:keepLines/>
         <w:spacing w:after="120" w:before="280"/>
       </w:pPr>
       <w:r>
@@ -1604,6 +1667,8 @@
     <w:p>
       <w:pPr>
         <w:pStyle w:val="Heading1"/>
+        <w:keepNext/>
+        <w:keepLines/>
         <w:spacing w:after="160" w:before="380"/>
       </w:pPr>
       <w:r>
@@ -1627,6 +1692,8 @@
     <w:p>
       <w:pPr>
         <w:pStyle w:val="Heading3"/>
+        <w:keepNext/>
+        <w:keepLines/>
         <w:spacing w:after="100" w:before="220"/>
       </w:pPr>
       <w:r>
@@ -1650,6 +1717,8 @@
     <w:p>
       <w:pPr>
         <w:pStyle w:val="Heading3"/>
+        <w:keepNext/>
+        <w:keepLines/>
         <w:spacing w:after="100" w:before="220"/>
       </w:pPr>
       <w:r>
@@ -1673,6 +1742,8 @@
     <w:p>
       <w:pPr>
         <w:pStyle w:val="Heading3"/>
+        <w:keepNext/>
+        <w:keepLines/>
         <w:spacing w:after="100" w:before="220"/>
       </w:pPr>
       <w:r>
@@ -1696,6 +1767,8 @@
     <w:p>
       <w:pPr>
         <w:pStyle w:val="Heading3"/>
+        <w:keepNext/>
+        <w:keepLines/>
         <w:spacing w:after="100" w:before="220"/>
       </w:pPr>
       <w:r>
@@ -1719,6 +1792,8 @@
     <w:p>
       <w:pPr>
         <w:pStyle w:val="Heading3"/>
+        <w:keepNext/>
+        <w:keepLines/>
         <w:spacing w:after="100" w:before="220"/>
       </w:pPr>
       <w:r>
@@ -1742,6 +1817,8 @@
     <w:p>
       <w:pPr>
         <w:pStyle w:val="Heading3"/>
+        <w:keepNext/>
+        <w:keepLines/>
         <w:spacing w:after="100" w:before="220"/>
       </w:pPr>
       <w:r>
@@ -1765,6 +1842,8 @@
     <w:p>
       <w:pPr>
         <w:pStyle w:val="Heading1"/>
+        <w:keepNext/>
+        <w:keepLines/>
         <w:spacing w:after="160" w:before="380"/>
       </w:pPr>
       <w:r>
@@ -1836,6 +1915,8 @@
     <w:p>
       <w:pPr>
         <w:pStyle w:val="Heading2"/>
+        <w:keepNext/>
+        <w:keepLines/>
         <w:spacing w:after="120" w:before="280"/>
       </w:pPr>
       <w:r>
@@ -1992,6 +2073,9 @@
         </w:tc>
       </w:tr>
       <w:tr>
+        <w:trPr>
+          <w:cantSplit/>
+        </w:trPr>
         <w:tc>
           <w:tcPr>
             <w:tcW w:type="dxa" w:w="1800"/>
@@ -2102,6 +2186,9 @@
         </w:tc>
       </w:tr>
       <w:tr>
+        <w:trPr>
+          <w:cantSplit/>
+        </w:trPr>
         <w:tc>
           <w:tcPr>
             <w:tcW w:type="dxa" w:w="1800"/>
@@ -2212,6 +2299,9 @@
         </w:tc>
       </w:tr>
       <w:tr>
+        <w:trPr>
+          <w:cantSplit/>
+        </w:trPr>
         <w:tc>
           <w:tcPr>
             <w:tcW w:type="dxa" w:w="1800"/>
@@ -2322,6 +2412,9 @@
         </w:tc>
       </w:tr>
       <w:tr>
+        <w:trPr>
+          <w:cantSplit/>
+        </w:trPr>
         <w:tc>
           <w:tcPr>
             <w:tcW w:type="dxa" w:w="1800"/>
@@ -2432,6 +2525,9 @@
         </w:tc>
       </w:tr>
       <w:tr>
+        <w:trPr>
+          <w:cantSplit/>
+        </w:trPr>
         <w:tc>
           <w:tcPr>
             <w:tcW w:type="dxa" w:w="1800"/>
@@ -2545,6 +2641,8 @@
     <w:p>
       <w:pPr>
         <w:pStyle w:val="Heading2"/>
+        <w:keepNext/>
+        <w:keepLines/>
         <w:spacing w:after="120" w:before="280"/>
       </w:pPr>
       <w:r>
@@ -2684,6 +2782,8 @@
     <w:p>
       <w:pPr>
         <w:pStyle w:val="Heading2"/>
+        <w:keepNext/>
+        <w:keepLines/>
         <w:spacing w:after="120" w:before="280"/>
       </w:pPr>
       <w:r>
@@ -2763,6 +2863,8 @@
     <w:p>
       <w:pPr>
         <w:pStyle w:val="Heading1"/>
+        <w:keepNext/>
+        <w:keepLines/>
         <w:spacing w:after="160" w:before="380"/>
       </w:pPr>
       <w:r>
@@ -2876,6 +2978,9 @@
         </w:tc>
       </w:tr>
       <w:tr>
+        <w:trPr>
+          <w:cantSplit/>
+        </w:trPr>
         <w:tc>
           <w:tcPr>
             <w:tcW w:type="dxa" w:w="2400"/>
@@ -2959,6 +3064,9 @@
         </w:tc>
       </w:tr>
       <w:tr>
+        <w:trPr>
+          <w:cantSplit/>
+        </w:trPr>
         <w:tc>
           <w:tcPr>
             <w:tcW w:type="dxa" w:w="2400"/>
@@ -3042,6 +3150,9 @@
         </w:tc>
       </w:tr>
       <w:tr>
+        <w:trPr>
+          <w:cantSplit/>
+        </w:trPr>
         <w:tc>
           <w:tcPr>
             <w:tcW w:type="dxa" w:w="2400"/>
@@ -3125,6 +3236,9 @@
         </w:tc>
       </w:tr>
       <w:tr>
+        <w:trPr>
+          <w:cantSplit/>
+        </w:trPr>
         <w:tc>
           <w:tcPr>
             <w:tcW w:type="dxa" w:w="2400"/>
@@ -3208,6 +3322,9 @@
         </w:tc>
       </w:tr>
       <w:tr>
+        <w:trPr>
+          <w:cantSplit/>
+        </w:trPr>
         <w:tc>
           <w:tcPr>
             <w:tcW w:type="dxa" w:w="2400"/>
@@ -3291,6 +3408,9 @@
         </w:tc>
       </w:tr>
       <w:tr>
+        <w:trPr>
+          <w:cantSplit/>
+        </w:trPr>
         <w:tc>
           <w:tcPr>
             <w:tcW w:type="dxa" w:w="2400"/>
@@ -3377,6 +3497,8 @@
     <w:p>
       <w:pPr>
         <w:pStyle w:val="Heading1"/>
+        <w:keepNext/>
+        <w:keepLines/>
         <w:spacing w:after="160" w:before="380"/>
       </w:pPr>
       <w:r>
@@ -3386,6 +3508,8 @@
     <w:p>
       <w:pPr>
         <w:pStyle w:val="Heading2"/>
+        <w:keepNext/>
+        <w:keepLines/>
         <w:spacing w:after="120" w:before="280"/>
       </w:pPr>
       <w:r>
@@ -3447,6 +3571,8 @@
     <w:p>
       <w:pPr>
         <w:pStyle w:val="Heading2"/>
+        <w:keepNext/>
+        <w:keepLines/>
         <w:spacing w:after="120" w:before="280"/>
       </w:pPr>
       <w:r>
@@ -3560,6 +3686,9 @@
         </w:tc>
       </w:tr>
       <w:tr>
+        <w:trPr>
+          <w:cantSplit/>
+        </w:trPr>
         <w:tc>
           <w:tcPr>
             <w:tcW w:type="dxa" w:w="1700"/>
@@ -3643,6 +3772,9 @@
         </w:tc>
       </w:tr>
       <w:tr>
+        <w:trPr>
+          <w:cantSplit/>
+        </w:trPr>
         <w:tc>
           <w:tcPr>
             <w:tcW w:type="dxa" w:w="1700"/>
@@ -3726,6 +3858,9 @@
         </w:tc>
       </w:tr>
       <w:tr>
+        <w:trPr>
+          <w:cantSplit/>
+        </w:trPr>
         <w:tc>
           <w:tcPr>
             <w:tcW w:type="dxa" w:w="1700"/>
@@ -3809,6 +3944,9 @@
         </w:tc>
       </w:tr>
       <w:tr>
+        <w:trPr>
+          <w:cantSplit/>
+        </w:trPr>
         <w:tc>
           <w:tcPr>
             <w:tcW w:type="dxa" w:w="1700"/>
@@ -3892,6 +4030,9 @@
         </w:tc>
       </w:tr>
       <w:tr>
+        <w:trPr>
+          <w:cantSplit/>
+        </w:trPr>
         <w:tc>
           <w:tcPr>
             <w:tcW w:type="dxa" w:w="1700"/>
@@ -3975,6 +4116,9 @@
         </w:tc>
       </w:tr>
       <w:tr>
+        <w:trPr>
+          <w:cantSplit/>
+        </w:trPr>
         <w:tc>
           <w:tcPr>
             <w:tcW w:type="dxa" w:w="1700"/>
@@ -4061,6 +4205,8 @@
     <w:p>
       <w:pPr>
         <w:pStyle w:val="Heading1"/>
+        <w:keepNext/>
+        <w:keepLines/>
         <w:spacing w:after="160" w:before="380"/>
       </w:pPr>
       <w:r>
@@ -4232,6 +4378,9 @@
         </w:tc>
       </w:tr>
       <w:tr>
+        <w:trPr>
+          <w:cantSplit/>
+        </w:trPr>
         <w:tc>
           <w:tcPr>
             <w:tcW w:type="dxa" w:w="700"/>
@@ -4369,6 +4518,9 @@
         </w:tc>
       </w:tr>
       <w:tr>
+        <w:trPr>
+          <w:cantSplit/>
+        </w:trPr>
         <w:tc>
           <w:tcPr>
             <w:tcW w:type="dxa" w:w="700"/>
@@ -4506,6 +4658,9 @@
         </w:tc>
       </w:tr>
       <w:tr>
+        <w:trPr>
+          <w:cantSplit/>
+        </w:trPr>
         <w:tc>
           <w:tcPr>
             <w:tcW w:type="dxa" w:w="700"/>
@@ -4643,6 +4798,9 @@
         </w:tc>
       </w:tr>
       <w:tr>
+        <w:trPr>
+          <w:cantSplit/>
+        </w:trPr>
         <w:tc>
           <w:tcPr>
             <w:tcW w:type="dxa" w:w="700"/>
@@ -4780,6 +4938,9 @@
         </w:tc>
       </w:tr>
       <w:tr>
+        <w:trPr>
+          <w:cantSplit/>
+        </w:trPr>
         <w:tc>
           <w:tcPr>
             <w:tcW w:type="dxa" w:w="700"/>
@@ -4917,6 +5078,9 @@
         </w:tc>
       </w:tr>
       <w:tr>
+        <w:trPr>
+          <w:cantSplit/>
+        </w:trPr>
         <w:tc>
           <w:tcPr>
             <w:tcW w:type="dxa" w:w="700"/>
@@ -5054,6 +5218,9 @@
         </w:tc>
       </w:tr>
       <w:tr>
+        <w:trPr>
+          <w:cantSplit/>
+        </w:trPr>
         <w:tc>
           <w:tcPr>
             <w:tcW w:type="dxa" w:w="700"/>
@@ -5191,6 +5358,9 @@
         </w:tc>
       </w:tr>
       <w:tr>
+        <w:trPr>
+          <w:cantSplit/>
+        </w:trPr>
         <w:tc>
           <w:tcPr>
             <w:tcW w:type="dxa" w:w="700"/>
@@ -5336,6 +5506,8 @@
     <w:p>
       <w:pPr>
         <w:pStyle w:val="Heading1"/>
+        <w:keepNext/>
+        <w:keepLines/>
         <w:spacing w:after="160" w:before="380"/>
       </w:pPr>
       <w:r>
@@ -5420,6 +5592,9 @@
         </w:tc>
       </w:tr>
       <w:tr>
+        <w:trPr>
+          <w:cantSplit/>
+        </w:trPr>
         <w:tc>
           <w:tcPr>
             <w:tcW w:type="dxa" w:w="2600"/>
@@ -5476,6 +5651,9 @@
         </w:tc>
       </w:tr>
       <w:tr>
+        <w:trPr>
+          <w:cantSplit/>
+        </w:trPr>
         <w:tc>
           <w:tcPr>
             <w:tcW w:type="dxa" w:w="2600"/>
@@ -5532,6 +5710,9 @@
         </w:tc>
       </w:tr>
       <w:tr>
+        <w:trPr>
+          <w:cantSplit/>
+        </w:trPr>
         <w:tc>
           <w:tcPr>
             <w:tcW w:type="dxa" w:w="2600"/>
@@ -5588,6 +5769,9 @@
         </w:tc>
       </w:tr>
       <w:tr>
+        <w:trPr>
+          <w:cantSplit/>
+        </w:trPr>
         <w:tc>
           <w:tcPr>
             <w:tcW w:type="dxa" w:w="2600"/>
@@ -5644,6 +5828,9 @@
         </w:tc>
       </w:tr>
       <w:tr>
+        <w:trPr>
+          <w:cantSplit/>
+        </w:trPr>
         <w:tc>
           <w:tcPr>
             <w:tcW w:type="dxa" w:w="2600"/>
@@ -5700,6 +5887,9 @@
         </w:tc>
       </w:tr>
       <w:tr>
+        <w:trPr>
+          <w:cantSplit/>
+        </w:trPr>
         <w:tc>
           <w:tcPr>
             <w:tcW w:type="dxa" w:w="2600"/>
@@ -5756,6 +5946,9 @@
         </w:tc>
       </w:tr>
       <w:tr>
+        <w:trPr>
+          <w:cantSplit/>
+        </w:trPr>
         <w:tc>
           <w:tcPr>
             <w:tcW w:type="dxa" w:w="2600"/>
@@ -5812,6 +6005,9 @@
         </w:tc>
       </w:tr>
       <w:tr>
+        <w:trPr>
+          <w:cantSplit/>
+        </w:trPr>
         <w:tc>
           <w:tcPr>
             <w:tcW w:type="dxa" w:w="2600"/>
@@ -5868,6 +6064,9 @@
         </w:tc>
       </w:tr>
       <w:tr>
+        <w:trPr>
+          <w:cantSplit/>
+        </w:trPr>
         <w:tc>
           <w:tcPr>
             <w:tcW w:type="dxa" w:w="2600"/>
@@ -5924,6 +6123,9 @@
         </w:tc>
       </w:tr>
       <w:tr>
+        <w:trPr>
+          <w:cantSplit/>
+        </w:trPr>
         <w:tc>
           <w:tcPr>
             <w:tcW w:type="dxa" w:w="2600"/>
@@ -5980,6 +6182,9 @@
         </w:tc>
       </w:tr>
       <w:tr>
+        <w:trPr>
+          <w:cantSplit/>
+        </w:trPr>
         <w:tc>
           <w:tcPr>
             <w:tcW w:type="dxa" w:w="2600"/>
@@ -6036,6 +6241,9 @@
         </w:tc>
       </w:tr>
       <w:tr>
+        <w:trPr>
+          <w:cantSplit/>
+        </w:trPr>
         <w:tc>
           <w:tcPr>
             <w:tcW w:type="dxa" w:w="2600"/>
@@ -6092,6 +6300,9 @@
         </w:tc>
       </w:tr>
       <w:tr>
+        <w:trPr>
+          <w:cantSplit/>
+        </w:trPr>
         <w:tc>
           <w:tcPr>
             <w:tcW w:type="dxa" w:w="2600"/>
@@ -6148,6 +6359,9 @@
         </w:tc>
       </w:tr>
       <w:tr>
+        <w:trPr>
+          <w:cantSplit/>
+        </w:trPr>
         <w:tc>
           <w:tcPr>
             <w:tcW w:type="dxa" w:w="2600"/>
@@ -6204,6 +6418,9 @@
         </w:tc>
       </w:tr>
       <w:tr>
+        <w:trPr>
+          <w:cantSplit/>
+        </w:trPr>
         <w:tc>
           <w:tcPr>
             <w:tcW w:type="dxa" w:w="2600"/>
@@ -6260,6 +6477,9 @@
         </w:tc>
       </w:tr>
       <w:tr>
+        <w:trPr>
+          <w:cantSplit/>
+        </w:trPr>
         <w:tc>
           <w:tcPr>
             <w:tcW w:type="dxa" w:w="2600"/>
@@ -6319,6 +6539,8 @@
     <w:p>
       <w:pPr>
         <w:pStyle w:val="Heading1"/>
+        <w:keepNext/>
+        <w:keepLines/>
         <w:spacing w:after="160" w:before="380"/>
       </w:pPr>
       <w:r>
@@ -6432,6 +6654,9 @@
         </w:tc>
       </w:tr>
       <w:tr>
+        <w:trPr>
+          <w:cantSplit/>
+        </w:trPr>
         <w:tc>
           <w:tcPr>
             <w:tcW w:type="dxa" w:w="1400"/>
@@ -6515,6 +6740,9 @@
         </w:tc>
       </w:tr>
       <w:tr>
+        <w:trPr>
+          <w:cantSplit/>
+        </w:trPr>
         <w:tc>
           <w:tcPr>
             <w:tcW w:type="dxa" w:w="1400"/>
@@ -6598,6 +6826,9 @@
         </w:tc>
       </w:tr>
       <w:tr>
+        <w:trPr>
+          <w:cantSplit/>
+        </w:trPr>
         <w:tc>
           <w:tcPr>
             <w:tcW w:type="dxa" w:w="1400"/>
@@ -6681,6 +6912,9 @@
         </w:tc>
       </w:tr>
       <w:tr>
+        <w:trPr>
+          <w:cantSplit/>
+        </w:trPr>
         <w:tc>
           <w:tcPr>
             <w:tcW w:type="dxa" w:w="1400"/>
@@ -6764,6 +6998,9 @@
         </w:tc>
       </w:tr>
       <w:tr>
+        <w:trPr>
+          <w:cantSplit/>
+        </w:trPr>
         <w:tc>
           <w:tcPr>
             <w:tcW w:type="dxa" w:w="1400"/>
@@ -6847,6 +7084,9 @@
         </w:tc>
       </w:tr>
       <w:tr>
+        <w:trPr>
+          <w:cantSplit/>
+        </w:trPr>
         <w:tc>
           <w:tcPr>
             <w:tcW w:type="dxa" w:w="1400"/>
@@ -6930,6 +7170,9 @@
         </w:tc>
       </w:tr>
       <w:tr>
+        <w:trPr>
+          <w:cantSplit/>
+        </w:trPr>
         <w:tc>
           <w:tcPr>
             <w:tcW w:type="dxa" w:w="1400"/>
@@ -7013,6 +7256,9 @@
         </w:tc>
       </w:tr>
       <w:tr>
+        <w:trPr>
+          <w:cantSplit/>
+        </w:trPr>
         <w:tc>
           <w:tcPr>
             <w:tcW w:type="dxa" w:w="1400"/>
@@ -7096,6 +7342,9 @@
         </w:tc>
       </w:tr>
       <w:tr>
+        <w:trPr>
+          <w:cantSplit/>
+        </w:trPr>
         <w:tc>
           <w:tcPr>
             <w:tcW w:type="dxa" w:w="1400"/>
@@ -7179,6 +7428,9 @@
         </w:tc>
       </w:tr>
       <w:tr>
+        <w:trPr>
+          <w:cantSplit/>
+        </w:trPr>
         <w:tc>
           <w:tcPr>
             <w:tcW w:type="dxa" w:w="1400"/>
@@ -7263,8 +7515,8 @@
       </w:tr>
     </w:tbl>
     <w:sectPr>
-      <w:headerReference w:type="default" r:id="rId7"/>
-      <w:footerReference w:type="default" r:id="rId8"/>
+      <w:headerReference w:type="default" r:id="rId6"/>
+      <w:footerReference w:type="default" r:id="rId7"/>
       <w:pgSz w:w="11906" w:h="16838" w:orient="portrait"/>
       <w:pgMar w:top="1140" w:right="1134" w:bottom="1140" w:left="1134" w:header="708" w:footer="708" w:gutter="0"/>
       <w:pgNumType/>
@@ -7272,10 +7524,6 @@
     </w:sectPr>
   </w:body>
 </w:document>
-</file>
-
-<file path=word/comments.xml><?xml version="1.0" encoding="utf-8"?>
-<w:comments xmlns:cx="http://schemas.microsoft.com/office/drawing/2014/chartex" xmlns:cx1="http://schemas.microsoft.com/office/drawing/2015/9/8/chartex" xmlns:cx2="http://schemas.microsoft.com/office/drawing/2015/10/21/chartex" xmlns:cx3="http://schemas.microsoft.com/office/drawing/2016/5/9/chartex" xmlns:cx4="http://schemas.microsoft.com/office/drawing/2016/5/10/chartex" xmlns:cx5="http://schemas.microsoft.com/office/drawing/2016/5/11/chartex" xmlns:cx6="http://schemas.microsoft.com/office/drawing/2016/5/12/chartex" xmlns:cx7="http://schemas.microsoft.com/office/drawing/2016/5/13/chartex" xmlns:cx8="http://schemas.microsoft.com/office/drawing/2016/5/14/chartex" xmlns:mc="http://schemas.openxmlformats.org/markup-compatibility/2006" xmlns:aink="http://schemas.microsoft.com/office/drawing/2016/ink" xmlns:am3d="http://schemas.microsoft.com/office/drawing/2017/model3d" xmlns:o="urn:schemas-microsoft-com:office:office" xmlns:r="http://schemas.openxmlformats.org/officeDocument/2006/relationships" xmlns:m="http://schemas.openxmlformats.org/officeDocument/2006/math" xmlns:v="urn:schemas-microsoft-com:vml" xmlns:wp14="http://schemas.microsoft.com/office/word/2010/wordprocessingDrawing" xmlns:wp="http://schemas.openxmlformats.org/drawingml/2006/wordprocessingDrawing" xmlns:w10="urn:schemas-microsoft-com:office:word" xmlns:w="http://schemas.openxmlformats.org/wordprocessingml/2006/main" xmlns:w14="http://schemas.microsoft.com/office/word/2010/wordml" xmlns:w15="http://schemas.microsoft.com/office/word/2012/wordml" xmlns:w16cex="http://schemas.microsoft.com/office/word/2018/wordml/cex" xmlns:w16cid="http://schemas.microsoft.com/office/word/2016/wordml/cid" xmlns:w16="http://schemas.microsoft.com/office/word/2018/wordml" xmlns:w16sdtdh="http://schemas.microsoft.com/office/word/2020/wordml/sdtdatahash" xmlns:w16se="http://schemas.microsoft.com/office/word/2015/wordml/symex" xmlns:wpg="http://schemas.microsoft.com/office/word/2010/wordprocessingGroup" xmlns:wpi="http://schemas.microsoft.com/office/word/2010/wordprocessingInk" xmlns:wne="http://schemas.microsoft.com/office/word/2006/wordml" xmlns:wps="http://schemas.microsoft.com/office/word/2010/wordprocessingShape"/>
 </file>
 
 <file path=word/endnotes.xml><?xml version="1.0" encoding="utf-8"?>
@@ -7424,7 +7672,7 @@
 <w:numbering xmlns:wpc="http://schemas.microsoft.com/office/word/2010/wordprocessingCanvas" xmlns:mc="http://schemas.openxmlformats.org/markup-compatibility/2006" xmlns:o="urn:schemas-microsoft-com:office:office" xmlns:r="http://schemas.openxmlformats.org/officeDocument/2006/relationships" xmlns:m="http://schemas.openxmlformats.org/officeDocument/2006/math" xmlns:v="urn:schemas-microsoft-com:vml" xmlns:wp14="http://schemas.microsoft.com/office/word/2010/wordprocessingDrawing" xmlns:wp="http://schemas.openxmlformats.org/drawingml/2006/wordprocessingDrawing" xmlns:w10="urn:schemas-microsoft-com:office:word" xmlns:w="http://schemas.openxmlformats.org/wordprocessingml/2006/main" xmlns:w14="http://schemas.microsoft.com/office/word/2010/wordml" xmlns:w15="http://schemas.microsoft.com/office/word/2012/wordml" xmlns:wpg="http://schemas.microsoft.com/office/word/2010/wordprocessingGroup" xmlns:wpi="http://schemas.microsoft.com/office/word/2010/wordprocessingInk" xmlns:wne="http://schemas.microsoft.com/office/word/2006/wordml" xmlns:wps="http://schemas.microsoft.com/office/word/2010/wordprocessingShape" mc:Ignorable="w14 w15 wp14">
   <w:abstractNum w:abstractNumId="1" w15:restartNumberingAfterBreak="0">
     <w:multiLevelType w:val="hybridMultilevel"/>
-    <w:lvl w:ilvl="0" w15:tentative="1">
+    <w:lvl w:ilvl="0" w:tentative="1">
       <w:start w:val="1"/>
       <w:numFmt w:val="bullet"/>
       <w:lvlText w:val="●"/>
@@ -7433,7 +7681,7 @@
         <w:ind w:left="720" w:hanging="360"/>
       </w:pPr>
     </w:lvl>
-    <w:lvl w:ilvl="1" w15:tentative="1">
+    <w:lvl w:ilvl="1" w:tentative="1">
       <w:start w:val="1"/>
       <w:numFmt w:val="bullet"/>
       <w:lvlText w:val="○"/>
@@ -7442,7 +7690,7 @@
         <w:ind w:left="1440" w:hanging="360"/>
       </w:pPr>
     </w:lvl>
-    <w:lvl w:ilvl="2" w15:tentative="1">
+    <w:lvl w:ilvl="2" w:tentative="1">
       <w:start w:val="1"/>
       <w:numFmt w:val="bullet"/>
       <w:lvlText w:val="■"/>
@@ -7451,7 +7699,7 @@
         <w:ind w:left="2160" w:hanging="360"/>
       </w:pPr>
     </w:lvl>
-    <w:lvl w:ilvl="3" w15:tentative="1">
+    <w:lvl w:ilvl="3" w:tentative="1">
       <w:start w:val="1"/>
       <w:numFmt w:val="bullet"/>
       <w:lvlText w:val="●"/>
@@ -7460,7 +7708,7 @@
         <w:ind w:left="2880" w:hanging="360"/>
       </w:pPr>
     </w:lvl>
-    <w:lvl w:ilvl="4" w15:tentative="1">
+    <w:lvl w:ilvl="4" w:tentative="1">
       <w:start w:val="1"/>
       <w:numFmt w:val="bullet"/>
       <w:lvlText w:val="○"/>
@@ -7469,7 +7717,7 @@
         <w:ind w:left="3600" w:hanging="360"/>
       </w:pPr>
     </w:lvl>
-    <w:lvl w:ilvl="5" w15:tentative="1">
+    <w:lvl w:ilvl="5" w:tentative="1">
       <w:start w:val="1"/>
       <w:numFmt w:val="bullet"/>
       <w:lvlText w:val="■"/>
@@ -7478,7 +7726,7 @@
         <w:ind w:left="4320" w:hanging="360"/>
       </w:pPr>
     </w:lvl>
-    <w:lvl w:ilvl="6" w15:tentative="1">
+    <w:lvl w:ilvl="6" w:tentative="1">
       <w:start w:val="1"/>
       <w:numFmt w:val="bullet"/>
       <w:lvlText w:val="●"/>
@@ -7487,7 +7735,7 @@
         <w:ind w:left="5040" w:hanging="360"/>
       </w:pPr>
     </w:lvl>
-    <w:lvl w:ilvl="7" w15:tentative="1">
+    <w:lvl w:ilvl="7" w:tentative="1">
       <w:start w:val="1"/>
       <w:numFmt w:val="bullet"/>
       <w:lvlText w:val="●"/>
@@ -7496,7 +7744,7 @@
         <w:ind w:left="5760" w:hanging="360"/>
       </w:pPr>
     </w:lvl>
-    <w:lvl w:ilvl="8" w15:tentative="1">
+    <w:lvl w:ilvl="8" w:tentative="1">
       <w:start w:val="1"/>
       <w:numFmt w:val="bullet"/>
       <w:lvlText w:val="●"/>
@@ -7508,7 +7756,7 @@
   </w:abstractNum>
   <w:abstractNum w:abstractNumId="2" w15:restartNumberingAfterBreak="0">
     <w:multiLevelType w:val="hybridMultilevel"/>
-    <w:lvl w:ilvl="0" w15:tentative="1">
+    <w:lvl w:ilvl="0" w:tentative="1">
       <w:start w:val="1"/>
       <w:numFmt w:val="bullet"/>
       <w:lvlText w:val="•"/>
@@ -7517,7 +7765,7 @@
         <w:ind w:left="420" w:hanging="250"/>
       </w:pPr>
     </w:lvl>
-    <w:lvl w:ilvl="1" w15:tentative="1">
+    <w:lvl w:ilvl="1" w:tentative="1">
       <w:start w:val="1"/>
       <w:numFmt w:val="bullet"/>
       <w:lvlText w:val="◦"/>
@@ -7526,7 +7774,7 @@
         <w:ind w:left="840" w:hanging="250"/>
       </w:pPr>
     </w:lvl>
-    <w:lvl w:ilvl="2" w15:tentative="1">
+    <w:lvl w:ilvl="2" w:tentative="1">
       <w:start w:val="1"/>
       <w:numFmt w:val="bullet"/>
       <w:lvlText w:val="▪"/>
@@ -7538,7 +7786,7 @@
   </w:abstractNum>
   <w:abstractNum w:abstractNumId="3" w15:restartNumberingAfterBreak="0">
     <w:multiLevelType w:val="hybridMultilevel"/>
-    <w:lvl w:ilvl="0" w15:tentative="1">
+    <w:lvl w:ilvl="0" w:tentative="1">
       <w:start w:val="1"/>
       <w:numFmt w:val="decimal"/>
       <w:lvlText w:val="%1."/>
@@ -7547,7 +7795,7 @@
         <w:ind w:left="440" w:hanging="280"/>
       </w:pPr>
     </w:lvl>
-    <w:lvl w:ilvl="1" w15:tentative="1">
+    <w:lvl w:ilvl="1" w:tentative="1">
       <w:start w:val="1"/>
       <w:numFmt w:val="lowerLetter"/>
       <w:lvlText w:val="%2)"/>
@@ -7594,6 +7842,10 @@
       </w:pPr>
     </w:pPrDefault>
   </w:docDefaults>
+  <w:style w:type="paragraph" w:styleId="Normal" w:default="1">
+    <w:name w:val="Normal"/>
+    <w:qFormat/>
+  </w:style>
   <w:style w:type="paragraph" w:styleId="Title">
     <w:name w:val="Title"/>
     <w:basedOn w:val="Normal"/>
@@ -7784,4 +8036,294 @@
     </w:rPr>
   </w:style>
 </w:styles>
+</file>
+
+<file path=word/theme/theme1.xml><?xml version="1.0" encoding="utf-8"?>
+<a:theme xmlns:a="http://schemas.openxmlformats.org/drawingml/2006/main" name="Office Theme">
+  <a:themeElements>
+    <a:clrScheme name="Office">
+      <a:dk1>
+        <a:sysClr val="windowText" lastClr="000000"/>
+      </a:dk1>
+      <a:lt1>
+        <a:sysClr val="window" lastClr="FFFFFF"/>
+      </a:lt1>
+      <a:dk2>
+        <a:srgbClr val="44546A"/>
+      </a:dk2>
+      <a:lt2>
+        <a:srgbClr val="E7E6E6"/>
+      </a:lt2>
+      <a:accent1>
+        <a:srgbClr val="4472C4"/>
+      </a:accent1>
+      <a:accent2>
+        <a:srgbClr val="ED7D31"/>
+      </a:accent2>
+      <a:accent3>
+        <a:srgbClr val="A5A5A5"/>
+      </a:accent3>
+      <a:accent4>
+        <a:srgbClr val="FFC000"/>
+      </a:accent4>
+      <a:accent5>
+        <a:srgbClr val="5B9BD5"/>
+      </a:accent5>
+      <a:accent6>
+        <a:srgbClr val="70AD47"/>
+      </a:accent6>
+      <a:hlink>
+        <a:srgbClr val="0563C1"/>
+      </a:hlink>
+      <a:folHlink>
+        <a:srgbClr val="954F72"/>
+      </a:folHlink>
+    </a:clrScheme>
+    <a:fontScheme name="Office">
+      <a:majorFont>
+        <a:latin typeface="Calibri Light" panose="020F0302020204030204"/>
+        <a:ea typeface=""/>
+        <a:cs typeface=""/>
+        <a:font script="Jpan" typeface="游ゴシック Light"/>
+        <a:font script="Hang" typeface="맑은 고딕"/>
+        <a:font script="Hans" typeface="等线 Light"/>
+        <a:font script="Hant" typeface="新細明體"/>
+        <a:font script="Arab" typeface="Times New Roman"/>
+        <a:font script="Hebr" typeface="Times New Roman"/>
+        <a:font script="Thai" typeface="Angsana New"/>
+        <a:font script="Ethi" typeface="Nyala"/>
+        <a:font script="Beng" typeface="Vrinda"/>
+        <a:font script="Gujr" typeface="Shruti"/>
+        <a:font script="Khmr" typeface="MoolBoran"/>
+        <a:font script="Knda" typeface="Tunga"/>
+        <a:font script="Guru" typeface="Raavi"/>
+        <a:font script="Cans" typeface="Euphemia"/>
+        <a:font script="Cher" typeface="Plantagenet Cherokee"/>
+        <a:font script="Yiii" typeface="Microsoft Yi Baiti"/>
+        <a:font script="Tibt" typeface="Microsoft Himalaya"/>
+        <a:font script="Thaa" typeface="MV Boli"/>
+        <a:font script="Deva" typeface="Mangal"/>
+        <a:font script="Telu" typeface="Gautami"/>
+        <a:font script="Taml" typeface="Latha"/>
+        <a:font script="Syrc" typeface="Estrangelo Edessa"/>
+        <a:font script="Orya" typeface="Kalinga"/>
+        <a:font script="Mlym" typeface="Kartika"/>
+        <a:font script="Laoo" typeface="DokChampa"/>
+        <a:font script="Sinh" typeface="Iskoola Pota"/>
+        <a:font script="Mong" typeface="Mongolian Baiti"/>
+        <a:font script="Viet" typeface="Times New Roman"/>
+        <a:font script="Uigh" typeface="Microsoft Uighur"/>
+        <a:font script="Geor" typeface="Sylfaen"/>
+        <a:font script="Armn" typeface="Arial"/>
+        <a:font script="Bugi" typeface="Leelawadee UI"/>
+        <a:font script="Bopo" typeface="Microsoft JhengHei"/>
+        <a:font script="Java" typeface="Javanese Text"/>
+        <a:font script="Lisu" typeface="Segoe UI"/>
+        <a:font script="Mymr" typeface="Myanmar Text"/>
+        <a:font script="Nkoo" typeface="Ebrima"/>
+        <a:font script="Olck" typeface="Nirmala UI"/>
+        <a:font script="Osma" typeface="Ebrima"/>
+        <a:font script="Phag" typeface="Phagspa"/>
+        <a:font script="Syrn" typeface="Estrangelo Edessa"/>
+        <a:font script="Syrj" typeface="Estrangelo Edessa"/>
+        <a:font script="Syre" typeface="Estrangelo Edessa"/>
+        <a:font script="Sora" typeface="Nirmala UI"/>
+        <a:font script="Tale" typeface="Microsoft Tai Le"/>
+        <a:font script="Talu" typeface="Microsoft New Tai Lue"/>
+        <a:font script="Tfng" typeface="Ebrima"/>
+      </a:majorFont>
+      <a:minorFont>
+        <a:latin typeface="Calibri" panose="020F0502020204030204"/>
+        <a:ea typeface=""/>
+        <a:cs typeface=""/>
+        <a:font script="Jpan" typeface="游明朝"/>
+        <a:font script="Hang" typeface="맑은 고딕"/>
+        <a:font script="Hans" typeface="等线"/>
+        <a:font script="Hant" typeface="新細明體"/>
+        <a:font script="Arab" typeface="Arial"/>
+        <a:font script="Hebr" typeface="Arial"/>
+        <a:font script="Thai" typeface="Cordia New"/>
+        <a:font script="Ethi" typeface="Nyala"/>
+        <a:font script="Beng" typeface="Vrinda"/>
+        <a:font script="Gujr" typeface="Shruti"/>
+        <a:font script="Khmr" typeface="DaunPenh"/>
+        <a:font script="Knda" typeface="Tunga"/>
+        <a:font script="Guru" typeface="Raavi"/>
+        <a:font script="Cans" typeface="Euphemia"/>
+        <a:font script="Cher" typeface="Plantagenet Cherokee"/>
+        <a:font script="Yiii" typeface="Microsoft Yi Baiti"/>
+        <a:font script="Tibt" typeface="Microsoft Himalaya"/>
+        <a:font script="Thaa" typeface="MV Boli"/>
+        <a:font script="Deva" typeface="Mangal"/>
+        <a:font script="Telu" typeface="Gautami"/>
+        <a:font script="Taml" typeface="Latha"/>
+        <a:font script="Syrc" typeface="Estrangelo Edessa"/>
+        <a:font script="Orya" typeface="Kalinga"/>
+        <a:font script="Mlym" typeface="Kartika"/>
+        <a:font script="Laoo" typeface="DokChampa"/>
+        <a:font script="Sinh" typeface="Iskoola Pota"/>
+        <a:font script="Mong" typeface="Mongolian Baiti"/>
+        <a:font script="Viet" typeface="Arial"/>
+        <a:font script="Uigh" typeface="Microsoft Uighur"/>
+        <a:font script="Geor" typeface="Sylfaen"/>
+        <a:font script="Armn" typeface="Arial"/>
+        <a:font script="Bugi" typeface="Leelawadee UI"/>
+        <a:font script="Bopo" typeface="Microsoft JhengHei"/>
+        <a:font script="Java" typeface="Javanese Text"/>
+        <a:font script="Lisu" typeface="Segoe UI"/>
+        <a:font script="Mymr" typeface="Myanmar Text"/>
+        <a:font script="Nkoo" typeface="Ebrima"/>
+        <a:font script="Olck" typeface="Nirmala UI"/>
+        <a:font script="Osma" typeface="Ebrima"/>
+        <a:font script="Phag" typeface="Phagspa"/>
+        <a:font script="Syrn" typeface="Estrangelo Edessa"/>
+        <a:font script="Syrj" typeface="Estrangelo Edessa"/>
+        <a:font script="Syre" typeface="Estrangelo Edessa"/>
+        <a:font script="Sora" typeface="Nirmala UI"/>
+        <a:font script="Tale" typeface="Microsoft Tai Le"/>
+        <a:font script="Talu" typeface="Microsoft New Tai Lue"/>
+        <a:font script="Tfng" typeface="Ebrima"/>
+      </a:minorFont>
+    </a:fontScheme>
+    <a:fmtScheme name="Office">
+      <a:fillStyleLst>
+        <a:solidFill>
+          <a:schemeClr val="phClr"/>
+        </a:solidFill>
+        <a:gradFill rotWithShape="true">
+          <a:gsLst>
+            <a:gs pos="0">
+              <a:schemeClr val="phClr">
+                <a:lumMod val="110000"/>
+                <a:satMod val="105000"/>
+                <a:tint val="67000"/>
+              </a:schemeClr>
+            </a:gs>
+            <a:gs pos="50000">
+              <a:schemeClr val="phClr">
+                <a:lumMod val="105000"/>
+                <a:satMod val="103000"/>
+                <a:tint val="73000"/>
+              </a:schemeClr>
+            </a:gs>
+            <a:gs pos="100000">
+              <a:schemeClr val="phClr">
+                <a:lumMod val="105000"/>
+                <a:satMod val="109000"/>
+                <a:tint val="81000"/>
+              </a:schemeClr>
+            </a:gs>
+          </a:gsLst>
+          <a:lin ang="5400000" scaled="false"/>
+        </a:gradFill>
+        <a:gradFill rotWithShape="true">
+          <a:gsLst>
+            <a:gs pos="0">
+              <a:schemeClr val="phClr">
+                <a:satMod val="103000"/>
+                <a:lumMod val="102000"/>
+                <a:tint val="94000"/>
+              </a:schemeClr>
+            </a:gs>
+            <a:gs pos="50000">
+              <a:schemeClr val="phClr">
+                <a:satMod val="110000"/>
+                <a:lumMod val="100000"/>
+                <a:shade val="100000"/>
+              </a:schemeClr>
+            </a:gs>
+            <a:gs pos="100000">
+              <a:schemeClr val="phClr">
+                <a:lumMod val="99000"/>
+                <a:satMod val="120000"/>
+                <a:shade val="78000"/>
+              </a:schemeClr>
+            </a:gs>
+          </a:gsLst>
+          <a:lin ang="5400000" scaled="false"/>
+        </a:gradFill>
+      </a:fillStyleLst>
+      <a:lnStyleLst>
+        <a:ln w="6350" cap="flat" cmpd="sng" algn="ctr">
+          <a:solidFill>
+            <a:schemeClr val="phClr"/>
+          </a:solidFill>
+          <a:prstDash val="solid"/>
+          <a:miter lim="800000"/>
+        </a:ln>
+        <a:ln w="12700" cap="flat" cmpd="sng" algn="ctr">
+          <a:solidFill>
+            <a:schemeClr val="phClr"/>
+          </a:solidFill>
+          <a:prstDash val="solid"/>
+          <a:miter lim="800000"/>
+        </a:ln>
+        <a:ln w="19050" cap="flat" cmpd="sng" algn="ctr">
+          <a:solidFill>
+            <a:schemeClr val="phClr"/>
+          </a:solidFill>
+          <a:prstDash val="solid"/>
+          <a:miter lim="800000"/>
+        </a:ln>
+      </a:lnStyleLst>
+      <a:effectStyleLst>
+        <a:effectStyle>
+          <a:effectLst/>
+        </a:effectStyle>
+        <a:effectStyle>
+          <a:effectLst/>
+        </a:effectStyle>
+        <a:effectStyle>
+          <a:effectLst>
+            <a:outerShdw blurRad="57150" dist="19050" dir="5400000" algn="ctr" rotWithShape="false">
+              <a:srgbClr val="000000">
+                <a:alpha val="63000"/>
+              </a:srgbClr>
+            </a:outerShdw>
+          </a:effectLst>
+        </a:effectStyle>
+      </a:effectStyleLst>
+      <a:bgFillStyleLst>
+        <a:solidFill>
+          <a:schemeClr val="phClr"/>
+        </a:solidFill>
+        <a:solidFill>
+          <a:schemeClr val="phClr">
+            <a:tint val="95000"/>
+            <a:satMod val="170000"/>
+          </a:schemeClr>
+        </a:solidFill>
+        <a:gradFill rotWithShape="true">
+          <a:gsLst>
+            <a:gs pos="0">
+              <a:schemeClr val="phClr">
+                <a:tint val="93000"/>
+                <a:satMod val="150000"/>
+                <a:shade val="98000"/>
+                <a:lumMod val="102000"/>
+              </a:schemeClr>
+            </a:gs>
+            <a:gs pos="50000">
+              <a:schemeClr val="phClr">
+                <a:tint val="98000"/>
+                <a:satMod val="130000"/>
+                <a:shade val="90000"/>
+                <a:lumMod val="103000"/>
+              </a:schemeClr>
+            </a:gs>
+            <a:gs pos="100000">
+              <a:schemeClr val="phClr">
+                <a:shade val="63000"/>
+                <a:satMod val="120000"/>
+              </a:schemeClr>
+            </a:gs>
+          </a:gsLst>
+          <a:lin ang="5400000" scaled="false"/>
+        </a:gradFill>
+      </a:bgFillStyleLst>
+    </a:fmtScheme>
+  </a:themeElements>
+  <a:objectDefaults/>
+  <a:extraClrSchemeLst/>
+</a:theme>
 </file>
</xml_diff>